<commit_message>
feat: docx sponsorship con proyecciones + hub Comunidad + emails CTA correctos
Directorio usa local@elcanaveral.info y LocalSEOAds info@localseoads.com
para captacion de servicios de agencia. Docx ampliado con seccion Comunidad
(75 cuentas), proyeccion trafico Q2/Q3/Q4 2026 + 2027, keywords objetivo,
hoja de ruta 12 meses y firma LocalSEOAds.com como titular oficial de
elcanaveral.info representada por John Guerrero como propietario.

Co-Authored-By: Claude Opus 4.7 (1M context) <noreply@anthropic.com>
</commit_message>
<xml_diff>
--- a/sponsorship-kit/Propuesta-Sponsorship-SM-Homes-elcanaveral.info.docx
+++ b/sponsorship-kit/Propuesta-Sponsorship-SM-Homes-elcanaveral.info.docx
@@ -853,7 +853,7 @@
           <w:color w:val="1F2937"/>
           <w:sz w:val="22"/>
         </w:rPr>
-        <w:t>Estamos construyendo más que un directorio. La hoja de ruta a 6 meses incluye:</w:t>
+        <w:t>Estamos construyendo más que un directorio. elcanaveral.info ya tiene una segunda capa —el hub Comunidad— y una hoja de ruta editorial pensada para convertirse en el primer destino digital del barrio.</w:t>
       </w:r>
     </w:p>
     <w:p>
@@ -861,6 +861,16 @@
         <w:pStyle w:val="ListBullet"/>
         <w:spacing w:after="40"/>
       </w:pPr>
+      <w:r>
+        <w:rPr>
+          <w:rFonts w:ascii="Calibri" w:hAnsi="Calibri"/>
+          <w:b/>
+          <w:i w:val="0"/>
+          <w:color w:val="1F2937"/>
+          <w:sz w:val="22"/>
+        </w:rPr>
+        <w:t>Comunidad</w:t>
+      </w:r>
       <w:r>
         <w:rPr>
           <w:rFonts w:ascii="Calibri" w:hAnsi="Calibri"/>
@@ -869,7 +879,7 @@
           <w:color w:val="1F2937"/>
           <w:sz w:val="22"/>
         </w:rPr>
-        <w:t>directorio de perfiles sociales del barrio (Facebook, Instagram, TikTok, X).</w:t>
+        <w:t xml:space="preserve"> — directorio de perfiles sociales del barrio (Facebook, Instagram, TikTok, X) — YA LIVE.</w:t>
       </w:r>
     </w:p>
     <w:p>
@@ -1284,6 +1294,1814 @@
           <w:sz w:val="22"/>
         </w:rPr>
         <w:t>Como sponsor, esta ficha incorporaría además: badge dorado 'Patrocinador oficial', tarjeta destacada en el sidebar de TODAS las fichas de la categoría con CTA directo a SM Homes, y posición fijada en el primer puesto independientemente del orden por defecto.</w:t>
+      </w:r>
+    </w:p>
+    <w:p>
+      <w:r>
+        <w:br w:type="page"/>
+      </w:r>
+    </w:p>
+    <w:p>
+      <w:pPr>
+        <w:spacing w:before="280" w:after="160"/>
+      </w:pPr>
+      <w:r>
+        <w:rPr>
+          <w:rFonts w:ascii="Calibri" w:hAnsi="Calibri"/>
+          <w:b/>
+          <w:i w:val="0"/>
+          <w:color w:val="2952A3"/>
+          <w:sz w:val="44"/>
+        </w:rPr>
+        <w:t>El hub Comunidad: más allá del directorio</w:t>
+      </w:r>
+    </w:p>
+    <w:p>
+      <w:pPr>
+        <w:spacing w:after="160"/>
+      </w:pPr>
+      <w:r>
+        <w:rPr>
+          <w:rFonts w:ascii="Calibri" w:hAnsi="Calibri"/>
+          <w:b w:val="0"/>
+          <w:i w:val="0"/>
+          <w:color w:val="1F2937"/>
+          <w:sz w:val="22"/>
+        </w:rPr>
+        <w:t>Hemos lanzado /comunidad/, una sección que reúne a toda la conversación digital del barrio en una sola página. No existe nada parecido en El Cañaveral. Lo que conseguimos con esto: que el vecino que busca 'qué pasa en el barrio' aterrice en elcanaveral.info, no en una búsqueda dispersa por Facebook o Instagram.</w:t>
+      </w:r>
+    </w:p>
+    <w:p>
+      <w:pPr>
+        <w:spacing w:before="280" w:after="160"/>
+      </w:pPr>
+      <w:r>
+        <w:rPr>
+          <w:rFonts w:ascii="Calibri" w:hAnsi="Calibri"/>
+          <w:b/>
+          <w:i w:val="0"/>
+          <w:color w:val="2952A3"/>
+          <w:sz w:val="32"/>
+        </w:rPr>
+        <w:t>Cifras del hub Comunidad</w:t>
+      </w:r>
+    </w:p>
+    <w:tbl>
+      <w:tblPr>
+        <w:tblW w:type="auto" w:w="0"/>
+        <w:jc w:val="center"/>
+        <w:tblLook w:firstColumn="1" w:firstRow="1" w:lastColumn="0" w:lastRow="0" w:noHBand="0" w:noVBand="1" w:val="04A0"/>
+      </w:tblPr>
+      <w:tblGrid>
+        <w:gridCol w:w="1624"/>
+        <w:gridCol w:w="1624"/>
+        <w:gridCol w:w="1624"/>
+        <w:gridCol w:w="1624"/>
+        <w:gridCol w:w="1624"/>
+        <w:gridCol w:w="1624"/>
+      </w:tblGrid>
+      <w:tr>
+        <w:tc>
+          <w:tcPr>
+            <w:tcW w:type="dxa" w:w="1624"/>
+            <w:vAlign w:val="center"/>
+          </w:tcPr>
+          <w:p>
+            <w:pPr>
+              <w:jc w:val="center"/>
+            </w:pPr>
+            <w:r>
+              <w:rPr>
+                <w:rFonts w:ascii="Calibri" w:hAnsi="Calibri"/>
+                <w:b/>
+                <w:i w:val="0"/>
+                <w:color w:val="2952A3"/>
+                <w:sz w:val="36"/>
+              </w:rPr>
+              <w:t>75+</w:t>
+            </w:r>
+          </w:p>
+        </w:tc>
+        <w:tc>
+          <w:tcPr>
+            <w:tcW w:type="dxa" w:w="1624"/>
+            <w:vAlign w:val="center"/>
+          </w:tcPr>
+          <w:p>
+            <w:pPr>
+              <w:jc w:val="center"/>
+            </w:pPr>
+            <w:r>
+              <w:rPr>
+                <w:rFonts w:ascii="Calibri" w:hAnsi="Calibri"/>
+                <w:b/>
+                <w:i w:val="0"/>
+                <w:color w:val="2952A3"/>
+                <w:sz w:val="36"/>
+              </w:rPr>
+              <w:t>8</w:t>
+            </w:r>
+          </w:p>
+        </w:tc>
+        <w:tc>
+          <w:tcPr>
+            <w:tcW w:type="dxa" w:w="1624"/>
+            <w:vAlign w:val="center"/>
+          </w:tcPr>
+          <w:p>
+            <w:pPr>
+              <w:jc w:val="center"/>
+            </w:pPr>
+            <w:r>
+              <w:rPr>
+                <w:rFonts w:ascii="Calibri" w:hAnsi="Calibri"/>
+                <w:b/>
+                <w:i w:val="0"/>
+                <w:color w:val="2952A3"/>
+                <w:sz w:val="36"/>
+              </w:rPr>
+              <w:t>16</w:t>
+            </w:r>
+          </w:p>
+        </w:tc>
+        <w:tc>
+          <w:tcPr>
+            <w:tcW w:type="dxa" w:w="1624"/>
+            <w:vAlign w:val="center"/>
+          </w:tcPr>
+          <w:p>
+            <w:pPr>
+              <w:jc w:val="center"/>
+            </w:pPr>
+            <w:r>
+              <w:rPr>
+                <w:rFonts w:ascii="Calibri" w:hAnsi="Calibri"/>
+                <w:b/>
+                <w:i w:val="0"/>
+                <w:color w:val="2952A3"/>
+                <w:sz w:val="36"/>
+              </w:rPr>
+              <w:t>25+</w:t>
+            </w:r>
+          </w:p>
+        </w:tc>
+        <w:tc>
+          <w:tcPr>
+            <w:tcW w:type="dxa" w:w="1624"/>
+            <w:vAlign w:val="center"/>
+          </w:tcPr>
+          <w:p>
+            <w:pPr>
+              <w:jc w:val="center"/>
+            </w:pPr>
+            <w:r>
+              <w:rPr>
+                <w:rFonts w:ascii="Calibri" w:hAnsi="Calibri"/>
+                <w:b/>
+                <w:i w:val="0"/>
+                <w:color w:val="2952A3"/>
+                <w:sz w:val="36"/>
+              </w:rPr>
+              <w:t>6.2K</w:t>
+            </w:r>
+          </w:p>
+        </w:tc>
+        <w:tc>
+          <w:tcPr>
+            <w:tcW w:type="dxa" w:w="1624"/>
+            <w:vAlign w:val="center"/>
+          </w:tcPr>
+          <w:p>
+            <w:pPr>
+              <w:jc w:val="center"/>
+            </w:pPr>
+            <w:r>
+              <w:rPr>
+                <w:rFonts w:ascii="Calibri" w:hAnsi="Calibri"/>
+                <w:b/>
+                <w:i w:val="0"/>
+                <w:color w:val="2952A3"/>
+                <w:sz w:val="36"/>
+              </w:rPr>
+              <w:t>3</w:t>
+            </w:r>
+          </w:p>
+        </w:tc>
+      </w:tr>
+      <w:tr>
+        <w:tc>
+          <w:tcPr>
+            <w:tcW w:type="dxa" w:w="1624"/>
+            <w:vAlign w:val="center"/>
+          </w:tcPr>
+          <w:p>
+            <w:pPr>
+              <w:jc w:val="center"/>
+            </w:pPr>
+            <w:r>
+              <w:rPr>
+                <w:rFonts w:ascii="Calibri" w:hAnsi="Calibri"/>
+                <w:b w:val="0"/>
+                <w:i w:val="0"/>
+                <w:color w:val="6B7280"/>
+                <w:sz w:val="16"/>
+              </w:rPr>
+              <w:t>cuentas verificadas</w:t>
+            </w:r>
+          </w:p>
+        </w:tc>
+        <w:tc>
+          <w:tcPr>
+            <w:tcW w:type="dxa" w:w="1624"/>
+            <w:vAlign w:val="center"/>
+          </w:tcPr>
+          <w:p>
+            <w:pPr>
+              <w:jc w:val="center"/>
+            </w:pPr>
+            <w:r>
+              <w:rPr>
+                <w:rFonts w:ascii="Calibri" w:hAnsi="Calibri"/>
+                <w:b w:val="0"/>
+                <w:i w:val="0"/>
+                <w:color w:val="6B7280"/>
+                <w:sz w:val="16"/>
+              </w:rPr>
+              <w:t>plataformas (FB, IG, X, TikTok, YouTube, Telegram, WhatsApp, web)</w:t>
+            </w:r>
+          </w:p>
+        </w:tc>
+        <w:tc>
+          <w:tcPr>
+            <w:tcW w:type="dxa" w:w="1624"/>
+            <w:vAlign w:val="center"/>
+          </w:tcPr>
+          <w:p>
+            <w:pPr>
+              <w:jc w:val="center"/>
+            </w:pPr>
+            <w:r>
+              <w:rPr>
+                <w:rFonts w:ascii="Calibri" w:hAnsi="Calibri"/>
+                <w:b w:val="0"/>
+                <w:i w:val="0"/>
+                <w:color w:val="6B7280"/>
+                <w:sz w:val="16"/>
+              </w:rPr>
+              <w:t>páginas Facebook (incluida Junta Municipal Vicálvaro oficial)</w:t>
+            </w:r>
+          </w:p>
+        </w:tc>
+        <w:tc>
+          <w:tcPr>
+            <w:tcW w:type="dxa" w:w="1624"/>
+            <w:vAlign w:val="center"/>
+          </w:tcPr>
+          <w:p>
+            <w:pPr>
+              <w:jc w:val="center"/>
+            </w:pPr>
+            <w:r>
+              <w:rPr>
+                <w:rFonts w:ascii="Calibri" w:hAnsi="Calibri"/>
+                <w:b w:val="0"/>
+                <w:i w:val="0"/>
+                <w:color w:val="6B7280"/>
+                <w:sz w:val="16"/>
+              </w:rPr>
+              <w:t>perfiles Instagram (vecinos, comercios, asociaciones)</w:t>
+            </w:r>
+          </w:p>
+        </w:tc>
+        <w:tc>
+          <w:tcPr>
+            <w:tcW w:type="dxa" w:w="1624"/>
+            <w:vAlign w:val="center"/>
+          </w:tcPr>
+          <w:p>
+            <w:pPr>
+              <w:jc w:val="center"/>
+            </w:pPr>
+            <w:r>
+              <w:rPr>
+                <w:rFonts w:ascii="Calibri" w:hAnsi="Calibri"/>
+                <w:b w:val="0"/>
+                <w:i w:val="0"/>
+                <w:color w:val="6B7280"/>
+                <w:sz w:val="16"/>
+              </w:rPr>
+              <w:t>miembros del grupo 'De El Cañaveral al cielo' indexado</w:t>
+            </w:r>
+          </w:p>
+        </w:tc>
+        <w:tc>
+          <w:tcPr>
+            <w:tcW w:type="dxa" w:w="1624"/>
+            <w:vAlign w:val="center"/>
+          </w:tcPr>
+          <w:p>
+            <w:pPr>
+              <w:jc w:val="center"/>
+            </w:pPr>
+            <w:r>
+              <w:rPr>
+                <w:rFonts w:ascii="Calibri" w:hAnsi="Calibri"/>
+                <w:b w:val="0"/>
+                <w:i w:val="0"/>
+                <w:color w:val="6B7280"/>
+                <w:sz w:val="16"/>
+              </w:rPr>
+              <w:t>niveles: Imprescindibles · Destacadas · Más cuentas</w:t>
+            </w:r>
+          </w:p>
+        </w:tc>
+      </w:tr>
+    </w:tbl>
+    <w:p>
+      <w:pPr>
+        <w:spacing w:after="120"/>
+      </w:pPr>
+      <w:r>
+        <w:rPr>
+          <w:rFonts w:ascii="Calibri" w:hAnsi="Calibri"/>
+          <w:b w:val="0"/>
+          <w:i w:val="0"/>
+          <w:color w:val="1F2937"/>
+          <w:sz w:val="22"/>
+        </w:rPr>
+      </w:r>
+    </w:p>
+    <w:p>
+      <w:pPr>
+        <w:spacing w:before="280" w:after="160"/>
+      </w:pPr>
+      <w:r>
+        <w:rPr>
+          <w:rFonts w:ascii="Calibri" w:hAnsi="Calibri"/>
+          <w:b/>
+          <w:i w:val="0"/>
+          <w:color w:val="2952A3"/>
+          <w:sz w:val="32"/>
+        </w:rPr>
+        <w:t>Por qué importa para SM Homes</w:t>
+      </w:r>
+    </w:p>
+    <w:p>
+      <w:pPr>
+        <w:pStyle w:val="ListBullet"/>
+        <w:spacing w:after="40"/>
+      </w:pPr>
+      <w:r>
+        <w:rPr>
+          <w:rFonts w:ascii="Calibri" w:hAnsi="Calibri"/>
+          <w:b/>
+          <w:i w:val="0"/>
+          <w:color w:val="1F2937"/>
+          <w:sz w:val="22"/>
+        </w:rPr>
+        <w:t>Asociación de marca</w:t>
+      </w:r>
+      <w:r>
+        <w:rPr>
+          <w:rFonts w:ascii="Calibri" w:hAnsi="Calibri"/>
+          <w:b w:val="0"/>
+          <w:i w:val="0"/>
+          <w:color w:val="1F2937"/>
+          <w:sz w:val="22"/>
+        </w:rPr>
+        <w:t xml:space="preserve"> — el sponsor del directorio es también el sponsor del hub social del barrio. Reconocimiento de marca asociado a la 'voz oficial' de El Cañaveral.</w:t>
+      </w:r>
+    </w:p>
+    <w:p>
+      <w:pPr>
+        <w:pStyle w:val="ListBullet"/>
+        <w:spacing w:after="40"/>
+      </w:pPr>
+      <w:r>
+        <w:rPr>
+          <w:rFonts w:ascii="Calibri" w:hAnsi="Calibri"/>
+          <w:b/>
+          <w:i w:val="0"/>
+          <w:color w:val="1F2937"/>
+          <w:sz w:val="22"/>
+        </w:rPr>
+        <w:t>Tráfico cualificado</w:t>
+      </w:r>
+      <w:r>
+        <w:rPr>
+          <w:rFonts w:ascii="Calibri" w:hAnsi="Calibri"/>
+          <w:b w:val="0"/>
+          <w:i w:val="0"/>
+          <w:color w:val="1F2937"/>
+          <w:sz w:val="22"/>
+        </w:rPr>
+        <w:t xml:space="preserve"> — los vecinos que llegan vía Comunidad son residentes activos en el barrio — exactamente el público objetivo de una inmobiliaria que vende y alquila aquí.</w:t>
+      </w:r>
+    </w:p>
+    <w:p>
+      <w:pPr>
+        <w:pStyle w:val="ListBullet"/>
+        <w:spacing w:after="40"/>
+      </w:pPr>
+      <w:r>
+        <w:rPr>
+          <w:rFonts w:ascii="Calibri" w:hAnsi="Calibri"/>
+          <w:b/>
+          <w:i w:val="0"/>
+          <w:color w:val="1F2937"/>
+          <w:sz w:val="22"/>
+        </w:rPr>
+        <w:t>Inventario adicional</w:t>
+      </w:r>
+      <w:r>
+        <w:rPr>
+          <w:rFonts w:ascii="Calibri" w:hAnsi="Calibri"/>
+          <w:b w:val="0"/>
+          <w:i w:val="0"/>
+          <w:color w:val="1F2937"/>
+          <w:sz w:val="22"/>
+        </w:rPr>
+        <w:t xml:space="preserve"> — el banner site-wide y la mención en home aparecen también en Comunidad. El hub aporta tráfico extra al inventario publicitario del sponsor.</w:t>
+      </w:r>
+    </w:p>
+    <w:p>
+      <w:r>
+        <w:br w:type="page"/>
+      </w:r>
+    </w:p>
+    <w:p>
+      <w:pPr>
+        <w:spacing w:before="280" w:after="160"/>
+      </w:pPr>
+      <w:r>
+        <w:rPr>
+          <w:rFonts w:ascii="Calibri" w:hAnsi="Calibri"/>
+          <w:b/>
+          <w:i w:val="0"/>
+          <w:color w:val="2952A3"/>
+          <w:sz w:val="44"/>
+        </w:rPr>
+        <w:t>Proyección de tráfico y crecimiento</w:t>
+      </w:r>
+    </w:p>
+    <w:p>
+      <w:pPr>
+        <w:spacing w:after="160"/>
+      </w:pPr>
+      <w:r>
+        <w:rPr>
+          <w:rFonts w:ascii="Calibri" w:hAnsi="Calibri"/>
+          <w:b w:val="0"/>
+          <w:i w:val="0"/>
+          <w:color w:val="1F2937"/>
+          <w:sz w:val="22"/>
+        </w:rPr>
+        <w:t>Estimaciones basadas en el ritmo de indexación actual, la velocidad de incorporación de negocios y el plan editorial de los próximos 9 meses. SEO local en un PAU joven con poca competencia es una de las jugadas con mejor retorno temporal del marketing digital.</w:t>
+      </w:r>
+    </w:p>
+    <w:tbl>
+      <w:tblPr>
+        <w:tblStyle w:val="LightGrid-Accent1"/>
+        <w:tblW w:type="auto" w:w="0"/>
+        <w:jc w:val="center"/>
+        <w:tblLook w:firstColumn="1" w:firstRow="1" w:lastColumn="0" w:lastRow="0" w:noHBand="0" w:noVBand="1" w:val="04A0"/>
+      </w:tblPr>
+      <w:tblGrid>
+        <w:gridCol w:w="2436"/>
+        <w:gridCol w:w="2436"/>
+        <w:gridCol w:w="2436"/>
+        <w:gridCol w:w="2436"/>
+      </w:tblGrid>
+      <w:tr>
+        <w:tc>
+          <w:tcPr>
+            <w:tcW w:type="dxa" w:w="2436"/>
+            <w:shd w:val="clear" w:color="auto" w:fill="1F2937"/>
+          </w:tcPr>
+          <w:p>
+            <w:pPr>
+              <w:jc w:val="center"/>
+            </w:pPr>
+            <w:r>
+              <w:rPr>
+                <w:rFonts w:ascii="Calibri" w:hAnsi="Calibri"/>
+                <w:b/>
+                <w:i w:val="0"/>
+                <w:color w:val="FFFFFF"/>
+                <w:sz w:val="20"/>
+              </w:rPr>
+              <w:t>Periodo</w:t>
+            </w:r>
+          </w:p>
+        </w:tc>
+        <w:tc>
+          <w:tcPr>
+            <w:tcW w:type="dxa" w:w="2436"/>
+            <w:shd w:val="clear" w:color="auto" w:fill="1F2937"/>
+          </w:tcPr>
+          <w:p>
+            <w:pPr>
+              <w:jc w:val="center"/>
+            </w:pPr>
+            <w:r>
+              <w:rPr>
+                <w:rFonts w:ascii="Calibri" w:hAnsi="Calibri"/>
+                <w:b/>
+                <w:i w:val="0"/>
+                <w:color w:val="FFFFFF"/>
+                <w:sz w:val="20"/>
+              </w:rPr>
+              <w:t>Visitas/mes (est.)</w:t>
+            </w:r>
+          </w:p>
+        </w:tc>
+        <w:tc>
+          <w:tcPr>
+            <w:tcW w:type="dxa" w:w="2436"/>
+            <w:shd w:val="clear" w:color="auto" w:fill="1F2937"/>
+          </w:tcPr>
+          <w:p>
+            <w:pPr>
+              <w:jc w:val="center"/>
+            </w:pPr>
+            <w:r>
+              <w:rPr>
+                <w:rFonts w:ascii="Calibri" w:hAnsi="Calibri"/>
+                <w:b/>
+                <w:i w:val="0"/>
+                <w:color w:val="FFFFFF"/>
+                <w:sz w:val="20"/>
+              </w:rPr>
+              <w:t>Páginas vistas</w:t>
+            </w:r>
+          </w:p>
+        </w:tc>
+        <w:tc>
+          <w:tcPr>
+            <w:tcW w:type="dxa" w:w="2436"/>
+            <w:shd w:val="clear" w:color="auto" w:fill="1F2937"/>
+          </w:tcPr>
+          <w:p>
+            <w:pPr>
+              <w:jc w:val="center"/>
+            </w:pPr>
+            <w:r>
+              <w:rPr>
+                <w:rFonts w:ascii="Calibri" w:hAnsi="Calibri"/>
+                <w:b/>
+                <w:i w:val="0"/>
+                <w:color w:val="FFFFFF"/>
+                <w:sz w:val="20"/>
+              </w:rPr>
+              <w:t>Hito</w:t>
+            </w:r>
+          </w:p>
+        </w:tc>
+      </w:tr>
+      <w:tr>
+        <w:tc>
+          <w:tcPr>
+            <w:tcW w:type="dxa" w:w="2436"/>
+          </w:tcPr>
+          <w:p>
+            <w:r>
+              <w:rPr>
+                <w:rFonts w:ascii="Calibri" w:hAnsi="Calibri"/>
+                <w:b/>
+                <w:i w:val="0"/>
+                <w:color w:val="1F2937"/>
+                <w:sz w:val="20"/>
+              </w:rPr>
+              <w:t>Q2 2026 (actual)</w:t>
+            </w:r>
+          </w:p>
+        </w:tc>
+        <w:tc>
+          <w:tcPr>
+            <w:tcW w:type="dxa" w:w="2436"/>
+          </w:tcPr>
+          <w:p>
+            <w:pPr>
+              <w:jc w:val="center"/>
+            </w:pPr>
+            <w:r>
+              <w:rPr>
+                <w:rFonts w:ascii="Calibri" w:hAnsi="Calibri"/>
+                <w:b w:val="0"/>
+                <w:i w:val="0"/>
+                <w:color w:val="1F2937"/>
+                <w:sz w:val="20"/>
+              </w:rPr>
+              <w:t>1.500 – 3.000</w:t>
+            </w:r>
+          </w:p>
+        </w:tc>
+        <w:tc>
+          <w:tcPr>
+            <w:tcW w:type="dxa" w:w="2436"/>
+          </w:tcPr>
+          <w:p>
+            <w:pPr>
+              <w:jc w:val="center"/>
+            </w:pPr>
+            <w:r>
+              <w:rPr>
+                <w:rFonts w:ascii="Calibri" w:hAnsi="Calibri"/>
+                <w:b w:val="0"/>
+                <w:i w:val="0"/>
+                <w:color w:val="1F2937"/>
+                <w:sz w:val="20"/>
+              </w:rPr>
+              <w:t>5.000 – 9.000</w:t>
+            </w:r>
+          </w:p>
+        </w:tc>
+        <w:tc>
+          <w:tcPr>
+            <w:tcW w:type="dxa" w:w="2436"/>
+          </w:tcPr>
+          <w:p>
+            <w:pPr>
+              <w:jc w:val="center"/>
+            </w:pPr>
+            <w:r>
+              <w:rPr>
+                <w:rFonts w:ascii="Calibri" w:hAnsi="Calibri"/>
+                <w:b w:val="0"/>
+                <w:i w:val="0"/>
+                <w:color w:val="1F2937"/>
+                <w:sz w:val="20"/>
+              </w:rPr>
+              <w:t>Lanzamiento, indexación inicial</w:t>
+            </w:r>
+          </w:p>
+        </w:tc>
+      </w:tr>
+      <w:tr>
+        <w:tc>
+          <w:tcPr>
+            <w:tcW w:type="dxa" w:w="2436"/>
+          </w:tcPr>
+          <w:p>
+            <w:r>
+              <w:rPr>
+                <w:rFonts w:ascii="Calibri" w:hAnsi="Calibri"/>
+                <w:b/>
+                <w:i w:val="0"/>
+                <w:color w:val="1F2937"/>
+                <w:sz w:val="20"/>
+              </w:rPr>
+              <w:t>Q3 2026</w:t>
+            </w:r>
+          </w:p>
+        </w:tc>
+        <w:tc>
+          <w:tcPr>
+            <w:tcW w:type="dxa" w:w="2436"/>
+          </w:tcPr>
+          <w:p>
+            <w:pPr>
+              <w:jc w:val="center"/>
+            </w:pPr>
+            <w:r>
+              <w:rPr>
+                <w:rFonts w:ascii="Calibri" w:hAnsi="Calibri"/>
+                <w:b w:val="0"/>
+                <w:i w:val="0"/>
+                <w:color w:val="1F2937"/>
+                <w:sz w:val="20"/>
+              </w:rPr>
+              <w:t>6.000 – 10.000</w:t>
+            </w:r>
+          </w:p>
+        </w:tc>
+        <w:tc>
+          <w:tcPr>
+            <w:tcW w:type="dxa" w:w="2436"/>
+          </w:tcPr>
+          <w:p>
+            <w:pPr>
+              <w:jc w:val="center"/>
+            </w:pPr>
+            <w:r>
+              <w:rPr>
+                <w:rFonts w:ascii="Calibri" w:hAnsi="Calibri"/>
+                <w:b w:val="0"/>
+                <w:i w:val="0"/>
+                <w:color w:val="1F2937"/>
+                <w:sz w:val="20"/>
+              </w:rPr>
+              <w:t>20.000 – 35.000</w:t>
+            </w:r>
+          </w:p>
+        </w:tc>
+        <w:tc>
+          <w:tcPr>
+            <w:tcW w:type="dxa" w:w="2436"/>
+          </w:tcPr>
+          <w:p>
+            <w:pPr>
+              <w:jc w:val="center"/>
+            </w:pPr>
+            <w:r>
+              <w:rPr>
+                <w:rFonts w:ascii="Calibri" w:hAnsi="Calibri"/>
+                <w:b w:val="0"/>
+                <w:i w:val="0"/>
+                <w:color w:val="1F2937"/>
+                <w:sz w:val="20"/>
+              </w:rPr>
+              <w:t>Pilares SEO + 200 negocios</w:t>
+            </w:r>
+          </w:p>
+        </w:tc>
+      </w:tr>
+      <w:tr>
+        <w:tc>
+          <w:tcPr>
+            <w:tcW w:type="dxa" w:w="2436"/>
+          </w:tcPr>
+          <w:p>
+            <w:r>
+              <w:rPr>
+                <w:rFonts w:ascii="Calibri" w:hAnsi="Calibri"/>
+                <w:b/>
+                <w:i w:val="0"/>
+                <w:color w:val="1F2937"/>
+                <w:sz w:val="20"/>
+              </w:rPr>
+              <w:t>Q4 2026</w:t>
+            </w:r>
+          </w:p>
+        </w:tc>
+        <w:tc>
+          <w:tcPr>
+            <w:tcW w:type="dxa" w:w="2436"/>
+          </w:tcPr>
+          <w:p>
+            <w:pPr>
+              <w:jc w:val="center"/>
+            </w:pPr>
+            <w:r>
+              <w:rPr>
+                <w:rFonts w:ascii="Calibri" w:hAnsi="Calibri"/>
+                <w:b w:val="0"/>
+                <w:i w:val="0"/>
+                <w:color w:val="1F2937"/>
+                <w:sz w:val="20"/>
+              </w:rPr>
+              <w:t>15.000 – 22.000</w:t>
+            </w:r>
+          </w:p>
+        </w:tc>
+        <w:tc>
+          <w:tcPr>
+            <w:tcW w:type="dxa" w:w="2436"/>
+          </w:tcPr>
+          <w:p>
+            <w:pPr>
+              <w:jc w:val="center"/>
+            </w:pPr>
+            <w:r>
+              <w:rPr>
+                <w:rFonts w:ascii="Calibri" w:hAnsi="Calibri"/>
+                <w:b w:val="0"/>
+                <w:i w:val="0"/>
+                <w:color w:val="1F2937"/>
+                <w:sz w:val="20"/>
+              </w:rPr>
+              <w:t>50.000 – 75.000</w:t>
+            </w:r>
+          </w:p>
+        </w:tc>
+        <w:tc>
+          <w:tcPr>
+            <w:tcW w:type="dxa" w:w="2436"/>
+          </w:tcPr>
+          <w:p>
+            <w:pPr>
+              <w:jc w:val="center"/>
+            </w:pPr>
+            <w:r>
+              <w:rPr>
+                <w:rFonts w:ascii="Calibri" w:hAnsi="Calibri"/>
+                <w:b w:val="0"/>
+                <w:i w:val="0"/>
+                <w:color w:val="1F2937"/>
+                <w:sz w:val="20"/>
+              </w:rPr>
+              <w:t>Blog editorial + newsletter activa</w:t>
+            </w:r>
+          </w:p>
+        </w:tc>
+      </w:tr>
+      <w:tr>
+        <w:tc>
+          <w:tcPr>
+            <w:tcW w:type="dxa" w:w="2436"/>
+          </w:tcPr>
+          <w:p>
+            <w:r>
+              <w:rPr>
+                <w:rFonts w:ascii="Calibri" w:hAnsi="Calibri"/>
+                <w:b/>
+                <w:i w:val="0"/>
+                <w:color w:val="1F2937"/>
+                <w:sz w:val="20"/>
+              </w:rPr>
+              <w:t>Q1 2027</w:t>
+            </w:r>
+          </w:p>
+        </w:tc>
+        <w:tc>
+          <w:tcPr>
+            <w:tcW w:type="dxa" w:w="2436"/>
+          </w:tcPr>
+          <w:p>
+            <w:pPr>
+              <w:jc w:val="center"/>
+            </w:pPr>
+            <w:r>
+              <w:rPr>
+                <w:rFonts w:ascii="Calibri" w:hAnsi="Calibri"/>
+                <w:b w:val="0"/>
+                <w:i w:val="0"/>
+                <w:color w:val="1F2937"/>
+                <w:sz w:val="20"/>
+              </w:rPr>
+              <w:t>25.000 – 35.000</w:t>
+            </w:r>
+          </w:p>
+        </w:tc>
+        <w:tc>
+          <w:tcPr>
+            <w:tcW w:type="dxa" w:w="2436"/>
+          </w:tcPr>
+          <w:p>
+            <w:pPr>
+              <w:jc w:val="center"/>
+            </w:pPr>
+            <w:r>
+              <w:rPr>
+                <w:rFonts w:ascii="Calibri" w:hAnsi="Calibri"/>
+                <w:b w:val="0"/>
+                <w:i w:val="0"/>
+                <w:color w:val="1F2937"/>
+                <w:sz w:val="20"/>
+              </w:rPr>
+              <w:t>85.000 – 120.000</w:t>
+            </w:r>
+          </w:p>
+        </w:tc>
+        <w:tc>
+          <w:tcPr>
+            <w:tcW w:type="dxa" w:w="2436"/>
+          </w:tcPr>
+          <w:p>
+            <w:pPr>
+              <w:jc w:val="center"/>
+            </w:pPr>
+            <w:r>
+              <w:rPr>
+                <w:rFonts w:ascii="Calibri" w:hAnsi="Calibri"/>
+                <w:b w:val="0"/>
+                <w:i w:val="0"/>
+                <w:color w:val="1F2937"/>
+                <w:sz w:val="20"/>
+              </w:rPr>
+              <w:t>Marca instalada en el PAU</w:t>
+            </w:r>
+          </w:p>
+        </w:tc>
+      </w:tr>
+      <w:tr>
+        <w:tc>
+          <w:tcPr>
+            <w:tcW w:type="dxa" w:w="2436"/>
+          </w:tcPr>
+          <w:p>
+            <w:r>
+              <w:rPr>
+                <w:rFonts w:ascii="Calibri" w:hAnsi="Calibri"/>
+                <w:b/>
+                <w:i w:val="0"/>
+                <w:color w:val="1F2937"/>
+                <w:sz w:val="20"/>
+              </w:rPr>
+              <w:t>Cierre 2027 (est.)</w:t>
+            </w:r>
+          </w:p>
+        </w:tc>
+        <w:tc>
+          <w:tcPr>
+            <w:tcW w:type="dxa" w:w="2436"/>
+          </w:tcPr>
+          <w:p>
+            <w:pPr>
+              <w:jc w:val="center"/>
+            </w:pPr>
+            <w:r>
+              <w:rPr>
+                <w:rFonts w:ascii="Calibri" w:hAnsi="Calibri"/>
+                <w:b w:val="0"/>
+                <w:i w:val="0"/>
+                <w:color w:val="1F2937"/>
+                <w:sz w:val="20"/>
+              </w:rPr>
+              <w:t>45.000 – 60.000</w:t>
+            </w:r>
+          </w:p>
+        </w:tc>
+        <w:tc>
+          <w:tcPr>
+            <w:tcW w:type="dxa" w:w="2436"/>
+          </w:tcPr>
+          <w:p>
+            <w:pPr>
+              <w:jc w:val="center"/>
+            </w:pPr>
+            <w:r>
+              <w:rPr>
+                <w:rFonts w:ascii="Calibri" w:hAnsi="Calibri"/>
+                <w:b w:val="0"/>
+                <w:i w:val="0"/>
+                <w:color w:val="1F2937"/>
+                <w:sz w:val="20"/>
+              </w:rPr>
+              <w:t>150.000 – 200.000</w:t>
+            </w:r>
+          </w:p>
+        </w:tc>
+        <w:tc>
+          <w:tcPr>
+            <w:tcW w:type="dxa" w:w="2436"/>
+          </w:tcPr>
+          <w:p>
+            <w:pPr>
+              <w:jc w:val="center"/>
+            </w:pPr>
+            <w:r>
+              <w:rPr>
+                <w:rFonts w:ascii="Calibri" w:hAnsi="Calibri"/>
+                <w:b w:val="0"/>
+                <w:i w:val="0"/>
+                <w:color w:val="1F2937"/>
+                <w:sz w:val="20"/>
+              </w:rPr>
+              <w:t>Referente del distrito Vicálvaro</w:t>
+            </w:r>
+          </w:p>
+        </w:tc>
+      </w:tr>
+    </w:tbl>
+    <w:p>
+      <w:pPr>
+        <w:spacing w:after="120"/>
+      </w:pPr>
+      <w:r>
+        <w:rPr>
+          <w:rFonts w:ascii="Calibri" w:hAnsi="Calibri"/>
+          <w:b w:val="0"/>
+          <w:i w:val="0"/>
+          <w:color w:val="1F2937"/>
+          <w:sz w:val="22"/>
+        </w:rPr>
+      </w:r>
+    </w:p>
+    <w:p>
+      <w:pPr>
+        <w:spacing w:after="160"/>
+      </w:pPr>
+      <w:r>
+        <w:rPr>
+          <w:rFonts w:ascii="Calibri" w:hAnsi="Calibri"/>
+          <w:b w:val="0"/>
+          <w:i w:val="0"/>
+          <w:color w:val="6B7280"/>
+          <w:sz w:val="20"/>
+        </w:rPr>
+        <w:t>La oferta de meses 1-2 gratuitos de SM Homes coincide exactamente con el tramo de mayor ROI del sponsor: entrar antes de la curva de crecimiento, no después.</w:t>
+      </w:r>
+    </w:p>
+    <w:p>
+      <w:r>
+        <w:br w:type="page"/>
+      </w:r>
+    </w:p>
+    <w:p>
+      <w:pPr>
+        <w:spacing w:before="280" w:after="160"/>
+      </w:pPr>
+      <w:r>
+        <w:rPr>
+          <w:rFonts w:ascii="Calibri" w:hAnsi="Calibri"/>
+          <w:b/>
+          <w:i w:val="0"/>
+          <w:color w:val="2952A3"/>
+          <w:sz w:val="44"/>
+        </w:rPr>
+        <w:t>Palabras clave que estamos atacando</w:t>
+      </w:r>
+    </w:p>
+    <w:p>
+      <w:pPr>
+        <w:spacing w:after="160"/>
+      </w:pPr>
+      <w:r>
+        <w:rPr>
+          <w:rFonts w:ascii="Calibri" w:hAnsi="Calibri"/>
+          <w:b w:val="0"/>
+          <w:i w:val="0"/>
+          <w:color w:val="1F2937"/>
+          <w:sz w:val="22"/>
+        </w:rPr>
+        <w:t>El SEO del directorio se ha estructurado como una matriz de servicio × zona: cada categoría se cruza con cada zona y cada subzona, generando cientos de páginas indexables que capturan intención de búsqueda hiperlocal. Estos son los grupos de keywords con mayor prioridad:</w:t>
+      </w:r>
+    </w:p>
+    <w:p>
+      <w:pPr>
+        <w:spacing w:before="280" w:after="160"/>
+      </w:pPr>
+      <w:r>
+        <w:rPr>
+          <w:rFonts w:ascii="Calibri" w:hAnsi="Calibri"/>
+          <w:b/>
+          <w:i w:val="0"/>
+          <w:color w:val="2952A3"/>
+          <w:sz w:val="32"/>
+        </w:rPr>
+        <w:t>Inmobiliario (prioridad sponsor)</w:t>
+      </w:r>
+    </w:p>
+    <w:p>
+      <w:pPr>
+        <w:pStyle w:val="ListBullet"/>
+        <w:spacing w:after="40"/>
+      </w:pPr>
+      <w:r>
+        <w:rPr>
+          <w:rFonts w:ascii="Calibri" w:hAnsi="Calibri"/>
+          <w:b w:val="0"/>
+          <w:i w:val="0"/>
+          <w:color w:val="1F2937"/>
+          <w:sz w:val="22"/>
+        </w:rPr>
+        <w:t>inmobiliaria El Cañaveral · agencia inmobiliaria El Cañaveral</w:t>
+      </w:r>
+    </w:p>
+    <w:p>
+      <w:pPr>
+        <w:pStyle w:val="ListBullet"/>
+        <w:spacing w:after="40"/>
+      </w:pPr>
+      <w:r>
+        <w:rPr>
+          <w:rFonts w:ascii="Calibri" w:hAnsi="Calibri"/>
+          <w:b w:val="0"/>
+          <w:i w:val="0"/>
+          <w:color w:val="1F2937"/>
+          <w:sz w:val="22"/>
+        </w:rPr>
+        <w:t>pisos en venta El Cañaveral · pisos alquiler PAU Cañaveral</w:t>
+      </w:r>
+    </w:p>
+    <w:p>
+      <w:pPr>
+        <w:pStyle w:val="ListBullet"/>
+        <w:spacing w:after="40"/>
+      </w:pPr>
+      <w:r>
+        <w:rPr>
+          <w:rFonts w:ascii="Calibri" w:hAnsi="Calibri"/>
+          <w:b w:val="0"/>
+          <w:i w:val="0"/>
+          <w:color w:val="1F2937"/>
+          <w:sz w:val="22"/>
+        </w:rPr>
+        <w:t>obra nueva Cañaveral · viviendas Vicálvaro · pisos Coslada</w:t>
+      </w:r>
+    </w:p>
+    <w:p>
+      <w:pPr>
+        <w:pStyle w:val="ListBullet"/>
+        <w:spacing w:after="40"/>
+      </w:pPr>
+      <w:r>
+        <w:rPr>
+          <w:rFonts w:ascii="Calibri" w:hAnsi="Calibri"/>
+          <w:b w:val="0"/>
+          <w:i w:val="0"/>
+          <w:color w:val="1F2937"/>
+          <w:sz w:val="22"/>
+        </w:rPr>
+        <w:t>inmobiliaria PAU Cañaveral · vender piso Cañaveral</w:t>
+      </w:r>
+    </w:p>
+    <w:p>
+      <w:pPr>
+        <w:pStyle w:val="ListBullet"/>
+        <w:spacing w:after="40"/>
+      </w:pPr>
+      <w:r>
+        <w:rPr>
+          <w:rFonts w:ascii="Calibri" w:hAnsi="Calibri"/>
+          <w:b w:val="0"/>
+          <w:i w:val="0"/>
+          <w:color w:val="1F2937"/>
+          <w:sz w:val="22"/>
+        </w:rPr>
+        <w:t>comprar casa El Cañaveral Madrid · alquiler PAU Cañaveral</w:t>
+      </w:r>
+    </w:p>
+    <w:p>
+      <w:pPr>
+        <w:spacing w:before="280" w:after="160"/>
+      </w:pPr>
+      <w:r>
+        <w:rPr>
+          <w:rFonts w:ascii="Calibri" w:hAnsi="Calibri"/>
+          <w:b/>
+          <w:i w:val="0"/>
+          <w:color w:val="2952A3"/>
+          <w:sz w:val="32"/>
+        </w:rPr>
+        <w:t>Servicios diarios</w:t>
+      </w:r>
+    </w:p>
+    <w:p>
+      <w:pPr>
+        <w:pStyle w:val="ListBullet"/>
+        <w:spacing w:after="40"/>
+      </w:pPr>
+      <w:r>
+        <w:rPr>
+          <w:rFonts w:ascii="Calibri" w:hAnsi="Calibri"/>
+          <w:b w:val="0"/>
+          <w:i w:val="0"/>
+          <w:color w:val="1F2937"/>
+          <w:sz w:val="22"/>
+        </w:rPr>
+        <w:t>supermercados El Cañaveral · fruterías Cañaveral · panaderías PAU</w:t>
+      </w:r>
+    </w:p>
+    <w:p>
+      <w:pPr>
+        <w:pStyle w:val="ListBullet"/>
+        <w:spacing w:after="40"/>
+      </w:pPr>
+      <w:r>
+        <w:rPr>
+          <w:rFonts w:ascii="Calibri" w:hAnsi="Calibri"/>
+          <w:b w:val="0"/>
+          <w:i w:val="0"/>
+          <w:color w:val="1F2937"/>
+          <w:sz w:val="22"/>
+        </w:rPr>
+        <w:t>restaurantes El Cañaveral · cafeterías Cañaveral · pizzerías PAU</w:t>
+      </w:r>
+    </w:p>
+    <w:p>
+      <w:pPr>
+        <w:pStyle w:val="ListBullet"/>
+        <w:spacing w:after="40"/>
+      </w:pPr>
+      <w:r>
+        <w:rPr>
+          <w:rFonts w:ascii="Calibri" w:hAnsi="Calibri"/>
+          <w:b w:val="0"/>
+          <w:i w:val="0"/>
+          <w:color w:val="1F2937"/>
+          <w:sz w:val="22"/>
+        </w:rPr>
+        <w:t>farmacia El Cañaveral · dentista Cañaveral · clínica PAU</w:t>
+      </w:r>
+    </w:p>
+    <w:p>
+      <w:pPr>
+        <w:pStyle w:val="ListBullet"/>
+        <w:spacing w:after="40"/>
+      </w:pPr>
+      <w:r>
+        <w:rPr>
+          <w:rFonts w:ascii="Calibri" w:hAnsi="Calibri"/>
+          <w:b w:val="0"/>
+          <w:i w:val="0"/>
+          <w:color w:val="1F2937"/>
+          <w:sz w:val="22"/>
+        </w:rPr>
+        <w:t>peluquería El Cañaveral · barbería Cañaveral · estética Vicálvaro</w:t>
+      </w:r>
+    </w:p>
+    <w:p>
+      <w:pPr>
+        <w:spacing w:before="280" w:after="160"/>
+      </w:pPr>
+      <w:r>
+        <w:rPr>
+          <w:rFonts w:ascii="Calibri" w:hAnsi="Calibri"/>
+          <w:b/>
+          <w:i w:val="0"/>
+          <w:color w:val="2952A3"/>
+          <w:sz w:val="32"/>
+        </w:rPr>
+        <w:t>Familias y mascotas</w:t>
+      </w:r>
+    </w:p>
+    <w:p>
+      <w:pPr>
+        <w:pStyle w:val="ListBullet"/>
+        <w:spacing w:after="40"/>
+      </w:pPr>
+      <w:r>
+        <w:rPr>
+          <w:rFonts w:ascii="Calibri" w:hAnsi="Calibri"/>
+          <w:b w:val="0"/>
+          <w:i w:val="0"/>
+          <w:color w:val="1F2937"/>
+          <w:sz w:val="22"/>
+        </w:rPr>
+        <w:t>guardería El Cañaveral · colegio CEIPSO Rudyard Kipling</w:t>
+      </w:r>
+    </w:p>
+    <w:p>
+      <w:pPr>
+        <w:pStyle w:val="ListBullet"/>
+        <w:spacing w:after="40"/>
+      </w:pPr>
+      <w:r>
+        <w:rPr>
+          <w:rFonts w:ascii="Calibri" w:hAnsi="Calibri"/>
+          <w:b w:val="0"/>
+          <w:i w:val="0"/>
+          <w:color w:val="1F2937"/>
+          <w:sz w:val="22"/>
+        </w:rPr>
+        <w:t>academia inglés Cañaveral · academia repaso PAU</w:t>
+      </w:r>
+    </w:p>
+    <w:p>
+      <w:pPr>
+        <w:pStyle w:val="ListBullet"/>
+        <w:spacing w:after="40"/>
+      </w:pPr>
+      <w:r>
+        <w:rPr>
+          <w:rFonts w:ascii="Calibri" w:hAnsi="Calibri"/>
+          <w:b w:val="0"/>
+          <w:i w:val="0"/>
+          <w:color w:val="1F2937"/>
+          <w:sz w:val="22"/>
+        </w:rPr>
+        <w:t>veterinario El Cañaveral · peluquería canina Cañaveral</w:t>
+      </w:r>
+    </w:p>
+    <w:p>
+      <w:pPr>
+        <w:spacing w:before="280" w:after="160"/>
+      </w:pPr>
+      <w:r>
+        <w:rPr>
+          <w:rFonts w:ascii="Calibri" w:hAnsi="Calibri"/>
+          <w:b/>
+          <w:i w:val="0"/>
+          <w:color w:val="2952A3"/>
+          <w:sz w:val="32"/>
+        </w:rPr>
+        <w:t>Hogar, deporte y ocio</w:t>
+      </w:r>
+    </w:p>
+    <w:p>
+      <w:pPr>
+        <w:pStyle w:val="ListBullet"/>
+        <w:spacing w:after="40"/>
+      </w:pPr>
+      <w:r>
+        <w:rPr>
+          <w:rFonts w:ascii="Calibri" w:hAnsi="Calibri"/>
+          <w:b w:val="0"/>
+          <w:i w:val="0"/>
+          <w:color w:val="1F2937"/>
+          <w:sz w:val="22"/>
+        </w:rPr>
+        <w:t>ferretería El Cañaveral · fontanero Cañaveral · electricista PAU</w:t>
+      </w:r>
+    </w:p>
+    <w:p>
+      <w:pPr>
+        <w:pStyle w:val="ListBullet"/>
+        <w:spacing w:after="40"/>
+      </w:pPr>
+      <w:r>
+        <w:rPr>
+          <w:rFonts w:ascii="Calibri" w:hAnsi="Calibri"/>
+          <w:b w:val="0"/>
+          <w:i w:val="0"/>
+          <w:color w:val="1F2937"/>
+          <w:sz w:val="22"/>
+        </w:rPr>
+        <w:t>gimnasio El Cañaveral · pádel Cañaveral · pilates PAU</w:t>
+      </w:r>
+    </w:p>
+    <w:p>
+      <w:pPr>
+        <w:pStyle w:val="ListBullet"/>
+        <w:spacing w:after="40"/>
+      </w:pPr>
+      <w:r>
+        <w:rPr>
+          <w:rFonts w:ascii="Calibri" w:hAnsi="Calibri"/>
+          <w:b w:val="0"/>
+          <w:i w:val="0"/>
+          <w:color w:val="1F2937"/>
+          <w:sz w:val="22"/>
+        </w:rPr>
+        <w:t>talleres mecánicos Cañaveral · ITV Vicálvaro</w:t>
+      </w:r>
+    </w:p>
+    <w:p>
+      <w:pPr>
+        <w:spacing w:before="280" w:after="160"/>
+      </w:pPr>
+      <w:r>
+        <w:rPr>
+          <w:rFonts w:ascii="Calibri" w:hAnsi="Calibri"/>
+          <w:b/>
+          <w:i w:val="0"/>
+          <w:color w:val="2952A3"/>
+          <w:sz w:val="32"/>
+        </w:rPr>
+        <w:t>Búsquedas de comunidad y vida en el barrio</w:t>
+      </w:r>
+    </w:p>
+    <w:p>
+      <w:pPr>
+        <w:pStyle w:val="ListBullet"/>
+        <w:spacing w:after="40"/>
+      </w:pPr>
+      <w:r>
+        <w:rPr>
+          <w:rFonts w:ascii="Calibri" w:hAnsi="Calibri"/>
+          <w:b w:val="0"/>
+          <w:i w:val="0"/>
+          <w:color w:val="1F2937"/>
+          <w:sz w:val="22"/>
+        </w:rPr>
+        <w:t>qué hacer en El Cañaveral · eventos PAU Cañaveral</w:t>
+      </w:r>
+    </w:p>
+    <w:p>
+      <w:pPr>
+        <w:pStyle w:val="ListBullet"/>
+        <w:spacing w:after="40"/>
+      </w:pPr>
+      <w:r>
+        <w:rPr>
+          <w:rFonts w:ascii="Calibri" w:hAnsi="Calibri"/>
+          <w:b w:val="0"/>
+          <w:i w:val="0"/>
+          <w:color w:val="1F2937"/>
+          <w:sz w:val="22"/>
+        </w:rPr>
+        <w:t>asociación vecinos El Cañaveral · noticias El Cañaveral</w:t>
+      </w:r>
+    </w:p>
+    <w:p>
+      <w:pPr>
+        <w:pStyle w:val="ListBullet"/>
+        <w:spacing w:after="40"/>
+      </w:pPr>
+      <w:r>
+        <w:rPr>
+          <w:rFonts w:ascii="Calibri" w:hAnsi="Calibri"/>
+          <w:b w:val="0"/>
+          <w:i w:val="0"/>
+          <w:color w:val="1F2937"/>
+          <w:sz w:val="22"/>
+        </w:rPr>
+        <w:t>Junta Municipal Vicálvaro · transporte PAU Cañaveral</w:t>
+      </w:r>
+    </w:p>
+    <w:p>
+      <w:pPr>
+        <w:pStyle w:val="ListBullet"/>
+        <w:spacing w:after="40"/>
+      </w:pPr>
+      <w:r>
+        <w:rPr>
+          <w:rFonts w:ascii="Calibri" w:hAnsi="Calibri"/>
+          <w:b w:val="0"/>
+          <w:i w:val="0"/>
+          <w:color w:val="1F2937"/>
+          <w:sz w:val="22"/>
+        </w:rPr>
+        <w:t>vivir en El Cañaveral · barrio El Cañaveral Madrid</w:t>
+      </w:r>
+    </w:p>
+    <w:p>
+      <w:r>
+        <w:br w:type="page"/>
+      </w:r>
+    </w:p>
+    <w:p>
+      <w:pPr>
+        <w:spacing w:before="280" w:after="160"/>
+      </w:pPr>
+      <w:r>
+        <w:rPr>
+          <w:rFonts w:ascii="Calibri" w:hAnsi="Calibri"/>
+          <w:b/>
+          <w:i w:val="0"/>
+          <w:color w:val="2952A3"/>
+          <w:sz w:val="44"/>
+        </w:rPr>
+        <w:t>Hoja de ruta: lo que viene</w:t>
+      </w:r>
+    </w:p>
+    <w:p>
+      <w:pPr>
+        <w:spacing w:after="160"/>
+      </w:pPr>
+      <w:r>
+        <w:rPr>
+          <w:rFonts w:ascii="Calibri" w:hAnsi="Calibri"/>
+          <w:b w:val="0"/>
+          <w:i w:val="0"/>
+          <w:color w:val="1F2937"/>
+          <w:sz w:val="22"/>
+        </w:rPr>
+        <w:t>El sponsorship de SM Homes financia la consolidación de elcanaveral.info como hub completo del barrio. Estas son las áreas que activamos en los próximos 12 meses, todas ellas con presencia visible del sponsor:</w:t>
+      </w:r>
+    </w:p>
+    <w:p>
+      <w:pPr>
+        <w:spacing w:before="280" w:after="160"/>
+      </w:pPr>
+      <w:r>
+        <w:rPr>
+          <w:rFonts w:ascii="Calibri" w:hAnsi="Calibri"/>
+          <w:b/>
+          <w:i w:val="0"/>
+          <w:color w:val="2952A3"/>
+          <w:sz w:val="32"/>
+        </w:rPr>
+        <w:t>Q3 2026 — Consolidación</w:t>
+      </w:r>
+    </w:p>
+    <w:p>
+      <w:pPr>
+        <w:pStyle w:val="ListBullet"/>
+        <w:spacing w:after="40"/>
+      </w:pPr>
+      <w:r>
+        <w:rPr>
+          <w:rFonts w:ascii="Calibri" w:hAnsi="Calibri"/>
+          <w:b/>
+          <w:i w:val="0"/>
+          <w:color w:val="1F2937"/>
+          <w:sz w:val="22"/>
+        </w:rPr>
+        <w:t>Directorio</w:t>
+      </w:r>
+      <w:r>
+        <w:rPr>
+          <w:rFonts w:ascii="Calibri" w:hAnsi="Calibri"/>
+          <w:b w:val="0"/>
+          <w:i w:val="0"/>
+          <w:color w:val="1F2937"/>
+          <w:sz w:val="22"/>
+        </w:rPr>
+        <w:t xml:space="preserve"> — ampliación a 200+ negocios (cobertura 95% comercio físico del PAU).</w:t>
+      </w:r>
+    </w:p>
+    <w:p>
+      <w:pPr>
+        <w:pStyle w:val="ListBullet"/>
+        <w:spacing w:after="40"/>
+      </w:pPr>
+      <w:r>
+        <w:rPr>
+          <w:rFonts w:ascii="Calibri" w:hAnsi="Calibri"/>
+          <w:b/>
+          <w:i w:val="0"/>
+          <w:color w:val="1F2937"/>
+          <w:sz w:val="22"/>
+        </w:rPr>
+        <w:t>Eventos</w:t>
+      </w:r>
+      <w:r>
+        <w:rPr>
+          <w:rFonts w:ascii="Calibri" w:hAnsi="Calibri"/>
+          <w:b w:val="0"/>
+          <w:i w:val="0"/>
+          <w:color w:val="1F2937"/>
+          <w:sz w:val="22"/>
+        </w:rPr>
+        <w:t xml:space="preserve"> — calendario público de eventos del barrio (mercados, fiestas, asociaciones).</w:t>
+      </w:r>
+    </w:p>
+    <w:p>
+      <w:pPr>
+        <w:pStyle w:val="ListBullet"/>
+        <w:spacing w:after="40"/>
+      </w:pPr>
+      <w:r>
+        <w:rPr>
+          <w:rFonts w:ascii="Calibri" w:hAnsi="Calibri"/>
+          <w:b/>
+          <w:i w:val="0"/>
+          <w:color w:val="1F2937"/>
+          <w:sz w:val="22"/>
+        </w:rPr>
+        <w:t>Guías prácticas</w:t>
+      </w:r>
+      <w:r>
+        <w:rPr>
+          <w:rFonts w:ascii="Calibri" w:hAnsi="Calibri"/>
+          <w:b w:val="0"/>
+          <w:i w:val="0"/>
+          <w:color w:val="1F2937"/>
+          <w:sz w:val="22"/>
+        </w:rPr>
+        <w:t xml:space="preserve"> — guías editoriales: 'cómo matricular en el cole', 'transporte al centro', 'servicios municipales'.</w:t>
+      </w:r>
+    </w:p>
+    <w:p>
+      <w:pPr>
+        <w:spacing w:before="280" w:after="160"/>
+      </w:pPr>
+      <w:r>
+        <w:rPr>
+          <w:rFonts w:ascii="Calibri" w:hAnsi="Calibri"/>
+          <w:b/>
+          <w:i w:val="0"/>
+          <w:color w:val="2952A3"/>
+          <w:sz w:val="32"/>
+        </w:rPr>
+        <w:t>Q4 2026 — Editorial y Audiencia</w:t>
+      </w:r>
+    </w:p>
+    <w:p>
+      <w:pPr>
+        <w:pStyle w:val="ListBullet"/>
+        <w:spacing w:after="40"/>
+      </w:pPr>
+      <w:r>
+        <w:rPr>
+          <w:rFonts w:ascii="Calibri" w:hAnsi="Calibri"/>
+          <w:b/>
+          <w:i w:val="0"/>
+          <w:color w:val="1F2937"/>
+          <w:sz w:val="22"/>
+        </w:rPr>
+        <w:t>Blog</w:t>
+      </w:r>
+      <w:r>
+        <w:rPr>
+          <w:rFonts w:ascii="Calibri" w:hAnsi="Calibri"/>
+          <w:b w:val="0"/>
+          <w:i w:val="0"/>
+          <w:color w:val="1F2937"/>
+          <w:sz w:val="22"/>
+        </w:rPr>
+        <w:t xml:space="preserve"> — blog con 1-2 piezas semanales sobre vida en el PAU. Cobertura SEO long-tail.</w:t>
+      </w:r>
+    </w:p>
+    <w:p>
+      <w:pPr>
+        <w:pStyle w:val="ListBullet"/>
+        <w:spacing w:after="40"/>
+      </w:pPr>
+      <w:r>
+        <w:rPr>
+          <w:rFonts w:ascii="Calibri" w:hAnsi="Calibri"/>
+          <w:b/>
+          <w:i w:val="0"/>
+          <w:color w:val="1F2937"/>
+          <w:sz w:val="22"/>
+        </w:rPr>
+        <w:t>Newsletter</w:t>
+      </w:r>
+      <w:r>
+        <w:rPr>
+          <w:rFonts w:ascii="Calibri" w:hAnsi="Calibri"/>
+          <w:b w:val="0"/>
+          <w:i w:val="0"/>
+          <w:color w:val="1F2937"/>
+          <w:sz w:val="22"/>
+        </w:rPr>
+        <w:t xml:space="preserve"> — boletín mensual con novedades del barrio y nuevos negocios listados.</w:t>
+      </w:r>
+    </w:p>
+    <w:p>
+      <w:pPr>
+        <w:pStyle w:val="ListBullet"/>
+        <w:spacing w:after="40"/>
+      </w:pPr>
+      <w:r>
+        <w:rPr>
+          <w:rFonts w:ascii="Calibri" w:hAnsi="Calibri"/>
+          <w:b/>
+          <w:i w:val="0"/>
+          <w:color w:val="1F2937"/>
+          <w:sz w:val="22"/>
+        </w:rPr>
+        <w:t>Mapa interactivo</w:t>
+      </w:r>
+      <w:r>
+        <w:rPr>
+          <w:rFonts w:ascii="Calibri" w:hAnsi="Calibri"/>
+          <w:b w:val="0"/>
+          <w:i w:val="0"/>
+          <w:color w:val="1F2937"/>
+          <w:sz w:val="22"/>
+        </w:rPr>
+        <w:t xml:space="preserve"> — mapa visual de El Cañaveral con todos los servicios geolocalizados.</w:t>
+      </w:r>
+    </w:p>
+    <w:p>
+      <w:pPr>
+        <w:spacing w:before="280" w:after="160"/>
+      </w:pPr>
+      <w:r>
+        <w:rPr>
+          <w:rFonts w:ascii="Calibri" w:hAnsi="Calibri"/>
+          <w:b/>
+          <w:i w:val="0"/>
+          <w:color w:val="2952A3"/>
+          <w:sz w:val="32"/>
+        </w:rPr>
+        <w:t>Q1 2027 — Servicios al Vecino</w:t>
+      </w:r>
+    </w:p>
+    <w:p>
+      <w:pPr>
+        <w:pStyle w:val="ListBullet"/>
+        <w:spacing w:after="40"/>
+      </w:pPr>
+      <w:r>
+        <w:rPr>
+          <w:rFonts w:ascii="Calibri" w:hAnsi="Calibri"/>
+          <w:b/>
+          <w:i w:val="0"/>
+          <w:color w:val="1F2937"/>
+          <w:sz w:val="22"/>
+        </w:rPr>
+        <w:t>Transporte</w:t>
+      </w:r>
+      <w:r>
+        <w:rPr>
+          <w:rFonts w:ascii="Calibri" w:hAnsi="Calibri"/>
+          <w:b w:val="0"/>
+          <w:i w:val="0"/>
+          <w:color w:val="1F2937"/>
+          <w:sz w:val="22"/>
+        </w:rPr>
+        <w:t xml:space="preserve"> — información actualizada de líneas de bus, EMT, próximas estaciones de Metro.</w:t>
+      </w:r>
+    </w:p>
+    <w:p>
+      <w:pPr>
+        <w:pStyle w:val="ListBullet"/>
+        <w:spacing w:after="40"/>
+      </w:pPr>
+      <w:r>
+        <w:rPr>
+          <w:rFonts w:ascii="Calibri" w:hAnsi="Calibri"/>
+          <w:b/>
+          <w:i w:val="0"/>
+          <w:color w:val="1F2937"/>
+          <w:sz w:val="22"/>
+        </w:rPr>
+        <w:t>Sanidad</w:t>
+      </w:r>
+      <w:r>
+        <w:rPr>
+          <w:rFonts w:ascii="Calibri" w:hAnsi="Calibri"/>
+          <w:b w:val="0"/>
+          <w:i w:val="0"/>
+          <w:color w:val="1F2937"/>
+          <w:sz w:val="22"/>
+        </w:rPr>
+        <w:t xml:space="preserve"> — directorio de centros de salud, especialistas concertados, farmacias de guardia.</w:t>
+      </w:r>
+    </w:p>
+    <w:p>
+      <w:pPr>
+        <w:pStyle w:val="ListBullet"/>
+        <w:spacing w:after="40"/>
+      </w:pPr>
+      <w:r>
+        <w:rPr>
+          <w:rFonts w:ascii="Calibri" w:hAnsi="Calibri"/>
+          <w:b/>
+          <w:i w:val="0"/>
+          <w:color w:val="1F2937"/>
+          <w:sz w:val="22"/>
+        </w:rPr>
+        <w:t>Servicios públicos</w:t>
+      </w:r>
+      <w:r>
+        <w:rPr>
+          <w:rFonts w:ascii="Calibri" w:hAnsi="Calibri"/>
+          <w:b w:val="0"/>
+          <w:i w:val="0"/>
+          <w:color w:val="1F2937"/>
+          <w:sz w:val="22"/>
+        </w:rPr>
+        <w:t xml:space="preserve"> — información oficial de la Junta Municipal de Vicálvaro y Ayuntamiento.</w:t>
+      </w:r>
+    </w:p>
+    <w:p>
+      <w:pPr>
+        <w:spacing w:before="280" w:after="160"/>
+      </w:pPr>
+      <w:r>
+        <w:rPr>
+          <w:rFonts w:ascii="Calibri" w:hAnsi="Calibri"/>
+          <w:b/>
+          <w:i w:val="0"/>
+          <w:color w:val="2952A3"/>
+          <w:sz w:val="32"/>
+        </w:rPr>
+        <w:t>Q2 2027 — Marca de Barrio</w:t>
+      </w:r>
+    </w:p>
+    <w:p>
+      <w:pPr>
+        <w:pStyle w:val="ListBullet"/>
+        <w:spacing w:after="40"/>
+      </w:pPr>
+      <w:r>
+        <w:rPr>
+          <w:rFonts w:ascii="Calibri" w:hAnsi="Calibri"/>
+          <w:b/>
+          <w:i w:val="0"/>
+          <w:color w:val="1F2937"/>
+          <w:sz w:val="22"/>
+        </w:rPr>
+        <w:t>Branding del barrio</w:t>
+      </w:r>
+      <w:r>
+        <w:rPr>
+          <w:rFonts w:ascii="Calibri" w:hAnsi="Calibri"/>
+          <w:b w:val="0"/>
+          <w:i w:val="0"/>
+          <w:color w:val="1F2937"/>
+          <w:sz w:val="22"/>
+        </w:rPr>
+        <w:t xml:space="preserve"> — merchandising/identidad asociada a 'Hecho en El Cañaveral'.</w:t>
+      </w:r>
+    </w:p>
+    <w:p>
+      <w:pPr>
+        <w:pStyle w:val="ListBullet"/>
+        <w:spacing w:after="40"/>
+      </w:pPr>
+      <w:r>
+        <w:rPr>
+          <w:rFonts w:ascii="Calibri" w:hAnsi="Calibri"/>
+          <w:b/>
+          <w:i w:val="0"/>
+          <w:color w:val="1F2937"/>
+          <w:sz w:val="22"/>
+        </w:rPr>
+        <w:t>Comunidad</w:t>
+      </w:r>
+      <w:r>
+        <w:rPr>
+          <w:rFonts w:ascii="Calibri" w:hAnsi="Calibri"/>
+          <w:b w:val="0"/>
+          <w:i w:val="0"/>
+          <w:color w:val="1F2937"/>
+          <w:sz w:val="22"/>
+        </w:rPr>
+        <w:t xml:space="preserve"> — patrocinios cruzados con asociaciones vecinales y eventos locales.</w:t>
+      </w:r>
+    </w:p>
+    <w:p>
+      <w:pPr>
+        <w:pStyle w:val="ListBullet"/>
+        <w:spacing w:after="40"/>
+      </w:pPr>
+      <w:r>
+        <w:rPr>
+          <w:rFonts w:ascii="Calibri" w:hAnsi="Calibri"/>
+          <w:b/>
+          <w:i w:val="0"/>
+          <w:color w:val="1F2937"/>
+          <w:sz w:val="22"/>
+        </w:rPr>
+        <w:t>Expansión</w:t>
+      </w:r>
+      <w:r>
+        <w:rPr>
+          <w:rFonts w:ascii="Calibri" w:hAnsi="Calibri"/>
+          <w:b w:val="0"/>
+          <w:i w:val="0"/>
+          <w:color w:val="1F2937"/>
+          <w:sz w:val="22"/>
+        </w:rPr>
+        <w:t xml:space="preserve"> — extensión a otros PAUs de Madrid bajo la misma plataforma LocalSEOAds.</w:t>
       </w:r>
     </w:p>
     <w:p>
@@ -1973,7 +3791,7 @@
     </w:p>
     <w:p>
       <w:pPr>
-        <w:spacing w:after="40"/>
+        <w:spacing w:after="160"/>
       </w:pPr>
       <w:r>
         <w:rPr>
@@ -1983,12 +3801,42 @@
           <w:color w:val="6B7280"/>
           <w:sz w:val="20"/>
         </w:rPr>
-        <w:t>LocalSEOAds.com — operador de elcanaveral.info</w:t>
+        <w:t>Propietario de LocalSEOAds.com — titular oficial de elcanaveral.info</w:t>
       </w:r>
     </w:p>
     <w:p>
       <w:pPr>
         <w:spacing w:after="40"/>
+      </w:pPr>
+      <w:r>
+        <w:rPr>
+          <w:rFonts w:ascii="Calibri" w:hAnsi="Calibri"/>
+          <w:b/>
+          <w:i w:val="0"/>
+          <w:color w:val="1F2937"/>
+          <w:sz w:val="20"/>
+        </w:rPr>
+        <w:t>Para esta propuesta y temas del directorio:</w:t>
+      </w:r>
+    </w:p>
+    <w:p>
+      <w:pPr>
+        <w:spacing w:after="40"/>
+      </w:pPr>
+      <w:r>
+        <w:rPr>
+          <w:rFonts w:ascii="Calibri" w:hAnsi="Calibri"/>
+          <w:b w:val="0"/>
+          <w:i w:val="0"/>
+          <w:color w:val="2952A3"/>
+          <w:sz w:val="20"/>
+        </w:rPr>
+        <w:t>local@elcanaveral.info</w:t>
+      </w:r>
+    </w:p>
+    <w:p>
+      <w:pPr>
+        <w:spacing w:after="160"/>
       </w:pPr>
       <w:r>
         <w:rPr>
@@ -1998,12 +3846,42 @@
           <w:color w:val="6B7280"/>
           <w:sz w:val="20"/>
         </w:rPr>
-        <w:t>Email: john@chefbusiness.co</w:t>
+        <w:t>www.elcanaveral.info</w:t>
       </w:r>
     </w:p>
     <w:p>
       <w:pPr>
         <w:spacing w:after="40"/>
+      </w:pPr>
+      <w:r>
+        <w:rPr>
+          <w:rFonts w:ascii="Calibri" w:hAnsi="Calibri"/>
+          <w:b/>
+          <w:i w:val="0"/>
+          <w:color w:val="1F2937"/>
+          <w:sz w:val="20"/>
+        </w:rPr>
+        <w:t>Para servicios de agencia digital (publicidad, web, SEO de tu empresa):</w:t>
+      </w:r>
+    </w:p>
+    <w:p>
+      <w:pPr>
+        <w:spacing w:after="40"/>
+      </w:pPr>
+      <w:r>
+        <w:rPr>
+          <w:rFonts w:ascii="Calibri" w:hAnsi="Calibri"/>
+          <w:b w:val="0"/>
+          <w:i w:val="0"/>
+          <w:color w:val="2952A3"/>
+          <w:sz w:val="20"/>
+        </w:rPr>
+        <w:t>info@localseoads.com</w:t>
+      </w:r>
+    </w:p>
+    <w:p>
+      <w:pPr>
+        <w:spacing w:after="240"/>
       </w:pPr>
       <w:r>
         <w:rPr>
@@ -2013,12 +3891,64 @@
           <w:color w:val="6B7280"/>
           <w:sz w:val="20"/>
         </w:rPr>
-        <w:t>Web: localseoads.com</w:t>
+        <w:t>www.localseoads.com</w:t>
       </w:r>
     </w:p>
     <w:p>
       <w:pPr>
-        <w:spacing w:after="240"/>
+        <w:pBdr>
+          <w:bottom w:val="single" w:sz="6" w:space="1" w:color="D5DBE5"/>
+        </w:pBdr>
+      </w:pPr>
+    </w:p>
+    <w:p>
+      <w:pPr>
+        <w:spacing w:before="280" w:after="160"/>
+      </w:pPr>
+      <w:r>
+        <w:rPr>
+          <w:rFonts w:ascii="Calibri" w:hAnsi="Calibri"/>
+          <w:b/>
+          <w:i w:val="0"/>
+          <w:color w:val="2952A3"/>
+          <w:sz w:val="32"/>
+        </w:rPr>
+        <w:t>Firma</w:t>
+      </w:r>
+    </w:p>
+    <w:p>
+      <w:pPr>
+        <w:spacing w:after="200"/>
+      </w:pPr>
+      <w:r>
+        <w:rPr>
+          <w:rFonts w:ascii="Calibri" w:hAnsi="Calibri"/>
+          <w:b w:val="0"/>
+          <w:i w:val="0"/>
+          <w:color w:val="1F2937"/>
+          <w:sz w:val="20"/>
+        </w:rPr>
+        <w:t>Esta propuesta de sponsorship la firma LocalSEOAds.com, en calidad de titular y operador del directorio elcanaveral.info, representada por John Guerrero como propietario oficial de ambas entidades.</w:t>
+      </w:r>
+    </w:p>
+    <w:p>
+      <w:pPr>
+        <w:spacing w:after="0"/>
+      </w:pPr>
+      <w:r>
+        <w:rPr>
+          <w:rFonts w:ascii="Calibri" w:hAnsi="Calibri"/>
+          <w:b/>
+          <w:i w:val="0"/>
+          <w:color w:val="1F2937"/>
+          <w:sz w:val="24"/>
+        </w:rPr>
+        <w:t>John Guerrero</w:t>
+      </w:r>
+    </w:p>
+    <w:p>
+      <w:pPr>
+        <w:spacing w:after="0"/>
       </w:pPr>
       <w:r>
         <w:rPr>
@@ -2028,12 +3958,27 @@
           <w:color w:val="6B7280"/>
           <w:sz w:val="20"/>
         </w:rPr>
-        <w:t>Directorio: www.elcanaveral.info</w:t>
+        <w:t>Propietario · LocalSEOAds.com</w:t>
       </w:r>
     </w:p>
     <w:p>
       <w:pPr>
-        <w:spacing w:before="400"/>
+        <w:spacing w:after="240"/>
+      </w:pPr>
+      <w:r>
+        <w:rPr>
+          <w:rFonts w:ascii="Calibri" w:hAnsi="Calibri"/>
+          <w:b w:val="0"/>
+          <w:i w:val="0"/>
+          <w:color w:val="6B7280"/>
+          <w:sz w:val="20"/>
+        </w:rPr>
+        <w:t>Titular del directorio elcanaveral.info</w:t>
+      </w:r>
+    </w:p>
+    <w:p>
+      <w:pPr>
+        <w:spacing w:before="320"/>
         <w:jc w:val="center"/>
       </w:pPr>
       <w:r>

</xml_diff>